<commit_message>
Presentación V3: reordenar diapositivas (situación original → RUP y UML → resultado)
Solo cambia el orden, sin tocar textos, diagramas ni notas: el bloque de
la web renovada (antes 7–11) pasa a 20–24. Se ajustan la numeración de
secciones y las referencias a diapositivas en la guía, los anexos y el
informe.

Co-Authored-By: Claude Opus 5.5 <noreply@anthropic.com>
Claude-Session: https://claude.ai/code/session_015bgTV8cWdz9SLoTLCZtcCS
</commit_message>
<xml_diff>
--- a/RUP_BLACK_HAWK/BLACK_HAWK_RUP_GUIA_EXPOSICION_V3.docx
+++ b/RUP_BLACK_HAWK/BLACK_HAWK_RUP_GUIA_EXPOSICION_V3.docx
@@ -137,7 +137,7 @@
           <w:sz w:val="18"/>
           <w:szCs w:val="18"/>
         </w:rPr>
-        <w:t xml:space="preserve"> Contexto y problema (1–6): unos 5,5 min. Solución y antes/después (7–11): unos 5 min. RUP (12–18): unos 7 min. Requisitos y UML (19–24): unos 5,5 min. Cierre (25–27): unos 2 min.</w:t>
+        <w:t xml:space="preserve"> Situación original y problema (1–6): unos 5,5 min. RUP (7–13): unos 7 min. Requisitos y UML (14–19): unos 5,5 min. Resultado: web renovada, antes/después, flujo y funcionalidades (20–24): unos 5 min. Cierre (25–27): unos 2 min.</w:t>
       </w:r>
     </w:p>
     <w:p>
@@ -6631,7 +6631,7 @@
                 <w:sz w:val="20"/>
                 <w:szCs w:val="20"/>
               </w:rPr>
-              <w:t xml:space="preserve">El sistema renovado</w:t>
+              <w:t xml:space="preserve">¿Qué es RUP y por qué se utiliza?</w:t>
             </w:r>
             <w:r>
               <w:rPr>
@@ -6639,7 +6639,7 @@
                 <w:sz w:val="17"/>
                 <w:szCs w:val="17"/>
               </w:rPr>
-              <w:t xml:space="preserve">   ·  55 s</w:t>
+              <w:t xml:space="preserve">   ·  60 s</w:t>
             </w:r>
           </w:p>
         </w:tc>
@@ -6705,7 +6705,7 @@
                 <w:sz w:val="18"/>
                 <w:szCs w:val="18"/>
               </w:rPr>
-              <w:t xml:space="preserve">Lo que entrego a Black Hawk es la web renovada: rediseño, catálogo y recorrido comercial sobre la misma plataforma.</w:t>
+              <w:t xml:space="preserve">RUP es una metodología iterativa, dirigida por casos de uso y centrada en la arquitectura; encaja con un proyecto que se construye por partes.</w:t>
             </w:r>
           </w:p>
         </w:tc>
@@ -6771,7 +6771,7 @@
                 <w:sz w:val="18"/>
                 <w:szCs w:val="18"/>
               </w:rPr>
-              <w:t xml:space="preserve">Hay que separar tres cosas: el sitio original (punto de partida), la web renovada que desarrollo (la solución) y las ampliaciones que propongo (lo que viene después).</w:t>
+              <w:t xml:space="preserve">La web renovada no se hizo de una vez: primero la home y la identidad, luego el catálogo y la ficha, después el recorrido de cotización. Cada parte se diseñó, construyó y verificó.</w:t>
             </w:r>
           </w:p>
         </w:tc>
@@ -6837,7 +6837,7 @@
                 <w:sz w:val="18"/>
                 <w:szCs w:val="18"/>
               </w:rPr>
-              <w:t xml:space="preserve">La web renovada está construida como tema hijo sobre WordPress y WooCommerce y ya funciona en un entorno de prueba.</w:t>
+              <w:t xml:space="preserve">El caso de uso «Cotizar por WhatsApp» guió el diseño de la ficha, del mensaje y de las pruebas.</w:t>
             </w:r>
           </w:p>
         </w:tc>
@@ -6905,7 +6905,7 @@
                 <w:sz w:val="18"/>
                 <w:szCs w:val="18"/>
               </w:rPr>
-              <w:t xml:space="preserve">Original</w:t>
+              <w:t xml:space="preserve">Iterativo</w:t>
             </w:r>
             <w:r>
               <w:rPr>
@@ -6921,7 +6921,7 @@
                 <w:sz w:val="18"/>
                 <w:szCs w:val="18"/>
               </w:rPr>
-              <w:t xml:space="preserve">Renovado</w:t>
+              <w:t xml:space="preserve">Casos de uso</w:t>
             </w:r>
             <w:r>
               <w:rPr>
@@ -6937,7 +6937,7 @@
                 <w:sz w:val="18"/>
                 <w:szCs w:val="18"/>
               </w:rPr>
-              <w:t xml:space="preserve">Ampliaciones</w:t>
+              <w:t xml:space="preserve">Arquitectura</w:t>
             </w:r>
           </w:p>
         </w:tc>
@@ -7005,19 +7005,19 @@
                 <w:sz w:val="18"/>
                 <w:szCs w:val="18"/>
               </w:rPr>
-              <w:t xml:space="preserve">¿Qué parte es su aporte?</w:t>
-            </w:r>
-          </w:p>
-          <w:p>
-            <w:pPr>
-              <w:spacing w:after="30" w:line="250"/>
-            </w:pPr>
-            <w:r>
-              <w:rPr>
-                <w:sz w:val="18"/>
-                <w:szCs w:val="18"/>
-              </w:rPr>
-              <w:t xml:space="preserve">El rediseño completo del sitio: identidad visual, catálogo, fichas, comparador y el recorrido de cotización. Las ampliaciones son propuestas.</w:t>
+              <w:t xml:space="preserve">¿Por qué RUP y no Scrum?</w:t>
+            </w:r>
+          </w:p>
+          <w:p>
+            <w:pPr>
+              <w:spacing w:after="30" w:line="250"/>
+            </w:pPr>
+            <w:r>
+              <w:rPr>
+                <w:sz w:val="18"/>
+                <w:szCs w:val="18"/>
+              </w:rPr>
+              <w:t xml:space="preserve">Porque el curso exige análisis y diseño formales con UML, y RUP combina iteraciones con hitos y artefactos de modelado.</w:t>
             </w:r>
           </w:p>
         </w:tc>
@@ -7085,7 +7085,7 @@
                 <w:sz w:val="20"/>
                 <w:szCs w:val="20"/>
               </w:rPr>
-              <w:t xml:space="preserve">Antes y después: home y catálogo</w:t>
+              <w:t xml:space="preserve">Estructura general de RUP</w:t>
             </w:r>
             <w:r>
               <w:rPr>
@@ -7093,7 +7093,7 @@
                 <w:sz w:val="17"/>
                 <w:szCs w:val="17"/>
               </w:rPr>
-              <w:t xml:space="preserve">   ·  70 s</w:t>
+              <w:t xml:space="preserve">   ·  65 s</w:t>
             </w:r>
           </w:p>
         </w:tc>
@@ -7159,7 +7159,7 @@
                 <w:sz w:val="18"/>
                 <w:szCs w:val="18"/>
               </w:rPr>
-              <w:t xml:space="preserve">Comparo pantallas equivalentes: qué había, qué necesidad detecté, qué cambié y qué espero lograr.</w:t>
+              <w:t xml:space="preserve">RUP tiene dos dimensiones: en el tiempo, fases e iteraciones; en el contenido, disciplinas.</w:t>
             </w:r>
           </w:p>
         </w:tc>
@@ -7225,7 +7225,7 @@
                 <w:sz w:val="18"/>
                 <w:szCs w:val="18"/>
               </w:rPr>
-              <w:t xml:space="preserve">Home: la marca ahora tiene jerarquía y el encabezado siempre ofrece buscar y cotizar. Catálogo: «Productos» ya no lleva a una tienda vacía; muestra los 118 productos con pestañas, contador y filtros.</w:t>
+              <w:t xml:space="preserve">Las columnas son las fases, con sus iteraciones. Las filas son las disciplinas. La barra indica cuánto trabajo tiene cada disciplina en cada fase: requisitos pesa más al inicio, implementación en construcción. Todas conviven: no es una cascada.</w:t>
             </w:r>
           </w:p>
         </w:tc>
@@ -7291,7 +7291,7 @@
                 <w:sz w:val="18"/>
                 <w:szCs w:val="18"/>
               </w:rPr>
-              <w:t xml:space="preserve">En el sitio original, al pulsar «Productos» aparecía «Tienda» sin productos; en la web renovada, el catálogo muestra 118.</w:t>
+              <w:t xml:space="preserve">En Elaboración ya se programó un prototipo, y en Construcción se ajustaron requisitos.</w:t>
             </w:r>
           </w:p>
         </w:tc>
@@ -7359,7 +7359,7 @@
                 <w:sz w:val="18"/>
                 <w:szCs w:val="18"/>
               </w:rPr>
-              <w:t xml:space="preserve">Jerarquía visual</w:t>
+              <w:t xml:space="preserve">Fase</w:t>
             </w:r>
             <w:r>
               <w:rPr>
@@ -7375,7 +7375,7 @@
                 <w:sz w:val="18"/>
                 <w:szCs w:val="18"/>
               </w:rPr>
-              <w:t xml:space="preserve">Llamada a la acción</w:t>
+              <w:t xml:space="preserve">Iteración</w:t>
             </w:r>
             <w:r>
               <w:rPr>
@@ -7391,7 +7391,23 @@
                 <w:sz w:val="18"/>
                 <w:szCs w:val="18"/>
               </w:rPr>
-              <w:t xml:space="preserve">Catálogo</w:t>
+              <w:t xml:space="preserve">Disciplina</w:t>
+            </w:r>
+            <w:r>
+              <w:rPr>
+                <w:sz w:val="18"/>
+                <w:szCs w:val="18"/>
+              </w:rPr>
+              <w:t xml:space="preserve">  ·  </w:t>
+            </w:r>
+            <w:r>
+              <w:rPr>
+                <w:b/>
+                <w:bCs/>
+                <w:sz w:val="18"/>
+                <w:szCs w:val="18"/>
+              </w:rPr>
+              <w:t xml:space="preserve">Hito</w:t>
             </w:r>
           </w:p>
         </w:tc>
@@ -7459,19 +7475,19 @@
                 <w:sz w:val="18"/>
                 <w:szCs w:val="18"/>
               </w:rPr>
-              <w:t xml:space="preserve">¿Cómo sabe que mejoró?</w:t>
-            </w:r>
-          </w:p>
-          <w:p>
-            <w:pPr>
-              <w:spacing w:after="30" w:line="250"/>
-            </w:pPr>
-            <w:r>
-              <w:rPr>
-                <w:sz w:val="18"/>
-                <w:szCs w:val="18"/>
-              </w:rPr>
-              <w:t xml:space="preserve">Por comparación directa de pantallas equivalentes. La mejora en uso se medirá con datos reales cuando se publique; no afirmo aumentos de ventas.</w:t>
+              <w:t xml:space="preserve">¿Qué diferencia hay entre fase y disciplina?</w:t>
+            </w:r>
+          </w:p>
+          <w:p>
+            <w:pPr>
+              <w:spacing w:after="30" w:line="250"/>
+            </w:pPr>
+            <w:r>
+              <w:rPr>
+                <w:sz w:val="18"/>
+                <w:szCs w:val="18"/>
+              </w:rPr>
+              <w:t xml:space="preserve">La fase es un periodo con un objetivo y un hito; la disciplina es un tipo de trabajo (requisitos, pruebas…) que ocurre en varias fases.</w:t>
             </w:r>
           </w:p>
         </w:tc>
@@ -7539,7 +7555,7 @@
                 <w:sz w:val="20"/>
                 <w:szCs w:val="20"/>
               </w:rPr>
-              <w:t xml:space="preserve">Antes y después: ficha y recorrido móvil</w:t>
+              <w:t xml:space="preserve">Fase de Inicio</w:t>
             </w:r>
             <w:r>
               <w:rPr>
@@ -7547,7 +7563,7 @@
                 <w:sz w:val="17"/>
                 <w:szCs w:val="17"/>
               </w:rPr>
-              <w:t xml:space="preserve">   ·  70 s</w:t>
+              <w:t xml:space="preserve">   ·  60 s</w:t>
             </w:r>
           </w:p>
         </w:tc>
@@ -7613,7 +7629,7 @@
                 <w:sz w:val="18"/>
                 <w:szCs w:val="18"/>
               </w:rPr>
-              <w:t xml:space="preserve">La ficha pasa de mostrar datos a llevar a una consulta, también en el celular.</w:t>
+              <w:t xml:space="preserve">En Inicio entendí el negocio y acordé qué construir. Está realizada.</w:t>
             </w:r>
           </w:p>
         </w:tc>
@@ -7679,7 +7695,7 @@
                 <w:sz w:val="18"/>
                 <w:szCs w:val="18"/>
               </w:rPr>
-              <w:t xml:space="preserve">Antes la ficha terminaba en las especificaciones. Ahora tiene «Cotizar» junto al modelo, «Comparar» y, en el celular, una barra fija con el botón de cotización.</w:t>
+              <w:t xml:space="preserve">Analicé el sitio original con capturas, identifiqué a los interesados y las necesidades, y fijé el alcance y las exclusiones. El hito LCO significa que los objetivos y el alcance quedan acordados.</w:t>
             </w:r>
           </w:p>
         </w:tc>
@@ -7745,7 +7761,7 @@
                 <w:sz w:val="18"/>
                 <w:szCs w:val="18"/>
               </w:rPr>
-              <w:t xml:space="preserve">En el celular, la ficha renovada del BH-SW12XXG muestra abajo «Cotizar · BH-SW12XXG» todo el tiempo.</w:t>
+              <w:t xml:space="preserve">La tienda vacía y la ficha sin consulta se documentaron en esta fase.</w:t>
             </w:r>
           </w:p>
         </w:tc>
@@ -7813,7 +7829,7 @@
                 <w:sz w:val="18"/>
                 <w:szCs w:val="18"/>
               </w:rPr>
-              <w:t xml:space="preserve">Ficha</w:t>
+              <w:t xml:space="preserve">Visión</w:t>
             </w:r>
             <w:r>
               <w:rPr>
@@ -7829,7 +7845,7 @@
                 <w:sz w:val="18"/>
                 <w:szCs w:val="18"/>
               </w:rPr>
-              <w:t xml:space="preserve">CTA</w:t>
+              <w:t xml:space="preserve">Stakeholders</w:t>
             </w:r>
             <w:r>
               <w:rPr>
@@ -7845,7 +7861,23 @@
                 <w:sz w:val="18"/>
                 <w:szCs w:val="18"/>
               </w:rPr>
-              <w:t xml:space="preserve">Diseño adaptable</w:t>
+              <w:t xml:space="preserve">Viabilidad</w:t>
+            </w:r>
+            <w:r>
+              <w:rPr>
+                <w:sz w:val="18"/>
+                <w:szCs w:val="18"/>
+              </w:rPr>
+              <w:t xml:space="preserve">  ·  </w:t>
+            </w:r>
+            <w:r>
+              <w:rPr>
+                <w:b/>
+                <w:bCs/>
+                <w:sz w:val="18"/>
+                <w:szCs w:val="18"/>
+              </w:rPr>
+              <w:t xml:space="preserve">LCO</w:t>
             </w:r>
           </w:p>
         </w:tc>
@@ -7913,19 +7945,19 @@
                 <w:sz w:val="18"/>
                 <w:szCs w:val="18"/>
               </w:rPr>
-              <w:t xml:space="preserve">¿Un clic en «Cotizar» es una venta?</w:t>
-            </w:r>
-          </w:p>
-          <w:p>
-            <w:pPr>
-              <w:spacing w:after="30" w:line="250"/>
-            </w:pPr>
-            <w:r>
-              <w:rPr>
-                <w:sz w:val="18"/>
-                <w:szCs w:val="18"/>
-              </w:rPr>
-              <w:t xml:space="preserve">No. Solo abre WhatsApp con el mensaje; la conversación y la venta ocurren fuera de la web.</w:t>
+              <w:t xml:space="preserve">¿Qué se entrega al terminar Inicio?</w:t>
+            </w:r>
+          </w:p>
+          <w:p>
+            <w:pPr>
+              <w:spacing w:after="30" w:line="250"/>
+            </w:pPr>
+            <w:r>
+              <w:rPr>
+                <w:sz w:val="18"/>
+                <w:szCs w:val="18"/>
+              </w:rPr>
+              <w:t xml:space="preserve">La visión, el análisis del sitio original, el modelo del negocio y los riesgos iniciales.</w:t>
             </w:r>
           </w:p>
         </w:tc>
@@ -7993,7 +8025,7 @@
                 <w:sz w:val="20"/>
                 <w:szCs w:val="20"/>
               </w:rPr>
-              <w:t xml:space="preserve">Flujo comercial propuesto</w:t>
+              <w:t xml:space="preserve">Fase de Elaboración</w:t>
             </w:r>
             <w:r>
               <w:rPr>
@@ -8067,7 +8099,7 @@
                 <w:sz w:val="18"/>
                 <w:szCs w:val="18"/>
               </w:rPr>
-              <w:t xml:space="preserve">El recorrido completo, desde el catálogo hasta la atención comercial, separando lo desarrollado de lo propuesto.</w:t>
+              <w:t xml:space="preserve">En Elaboración definí requisitos, modelé con UML y validé la arquitectura. Está realizada.</w:t>
             </w:r>
           </w:p>
         </w:tc>
@@ -8133,7 +8165,7 @@
                 <w:sz w:val="18"/>
                 <w:szCs w:val="18"/>
               </w:rPr>
-              <w:t xml:space="preserve">La fila negra es lo que ya funciona en la web renovada. Debajo, en morado punteado, las ampliaciones: registrar el inicio de la consulta, un directorio estructurado y el seguimiento, que requiere un mecanismo adicional.</w:t>
+              <w:t xml:space="preserve">Aquí se decide cómo será el sistema antes de construirlo: requisitos, casos de uso, diagramas, arquitectura y prototipos. La decisión clave fue rediseñar sobre la misma plataforma con un tema hijo. El hito LCA indica que la arquitectura está validada.</w:t>
             </w:r>
           </w:p>
         </w:tc>
@@ -8199,7 +8231,7 @@
                 <w:sz w:val="18"/>
                 <w:szCs w:val="18"/>
               </w:rPr>
-              <w:t xml:space="preserve">El mensaje dice: «Hola Black Hawk, vengo de la web y quiero cotizar el modelo BH-SW12XXG».</w:t>
+              <w:t xml:space="preserve">Antes de construir se definió cómo serían la home, el catálogo, la ficha y el comparador, y cómo se conectarían con WooCommerce.</w:t>
             </w:r>
           </w:p>
         </w:tc>
@@ -8267,7 +8299,7 @@
                 <w:sz w:val="18"/>
                 <w:szCs w:val="18"/>
               </w:rPr>
-              <w:t xml:space="preserve">Recorrido</w:t>
+              <w:t xml:space="preserve">Requisitos</w:t>
             </w:r>
             <w:r>
               <w:rPr>
@@ -8283,7 +8315,7 @@
                 <w:sz w:val="18"/>
                 <w:szCs w:val="18"/>
               </w:rPr>
-              <w:t xml:space="preserve">CTA</w:t>
+              <w:t xml:space="preserve">Casos de uso</w:t>
             </w:r>
             <w:r>
               <w:rPr>
@@ -8299,7 +8331,23 @@
                 <w:sz w:val="18"/>
                 <w:szCs w:val="18"/>
               </w:rPr>
-              <w:t xml:space="preserve">Ampliación</w:t>
+              <w:t xml:space="preserve">Arquitectura</w:t>
+            </w:r>
+            <w:r>
+              <w:rPr>
+                <w:sz w:val="18"/>
+                <w:szCs w:val="18"/>
+              </w:rPr>
+              <w:t xml:space="preserve">  ·  </w:t>
+            </w:r>
+            <w:r>
+              <w:rPr>
+                <w:b/>
+                <w:bCs/>
+                <w:sz w:val="18"/>
+                <w:szCs w:val="18"/>
+              </w:rPr>
+              <w:t xml:space="preserve">LCA</w:t>
             </w:r>
           </w:p>
         </w:tc>
@@ -8367,19 +8415,19 @@
                 <w:sz w:val="18"/>
                 <w:szCs w:val="18"/>
               </w:rPr>
-              <w:t xml:space="preserve">¿El sistema sabe si el cliente compró?</w:t>
-            </w:r>
-          </w:p>
-          <w:p>
-            <w:pPr>
-              <w:spacing w:after="30" w:line="250"/>
-            </w:pPr>
-            <w:r>
-              <w:rPr>
-                <w:sz w:val="18"/>
-                <w:szCs w:val="18"/>
-              </w:rPr>
-              <w:t xml:space="preserve">No. Solo sabe que se abrió WhatsApp desde una página; el resultado requiere seguimiento manual u otra herramienta.</w:t>
+              <w:t xml:space="preserve">¿Por qué no reescribir la web desde cero?</w:t>
+            </w:r>
+          </w:p>
+          <w:p>
+            <w:pPr>
+              <w:spacing w:after="30" w:line="250"/>
+            </w:pPr>
+            <w:r>
+              <w:rPr>
+                <w:sz w:val="18"/>
+                <w:szCs w:val="18"/>
+              </w:rPr>
+              <w:t xml:space="preserve">Porque la plataforma ya tenía el catálogo y el equipo sabe usarla; rediseñar sobre ella es más barato y menos riesgoso.</w:t>
             </w:r>
           </w:p>
         </w:tc>
@@ -8447,7 +8495,7 @@
                 <w:sz w:val="20"/>
                 <w:szCs w:val="20"/>
               </w:rPr>
-              <w:t xml:space="preserve">Funcionalidades principales</w:t>
+              <w:t xml:space="preserve">Fase de Construcción</w:t>
             </w:r>
             <w:r>
               <w:rPr>
@@ -8455,7 +8503,7 @@
                 <w:sz w:val="17"/>
                 <w:szCs w:val="17"/>
               </w:rPr>
-              <w:t xml:space="preserve">   ·  55 s</w:t>
+              <w:t xml:space="preserve">   ·  65 s</w:t>
             </w:r>
           </w:p>
         </w:tc>
@@ -8521,7 +8569,7 @@
                 <w:sz w:val="18"/>
                 <w:szCs w:val="18"/>
               </w:rPr>
-              <w:t xml:space="preserve">Cinco grupos de funciones: cuatro desarrollados en el rediseño y uno propuesto.</w:t>
+              <w:t xml:space="preserve">En Construcción desarrollé la web renovada por incrementos. Está en curso: el rediseño funciona; las ampliaciones están planificadas.</w:t>
             </w:r>
           </w:p>
         </w:tc>
@@ -8587,7 +8635,7 @@
                 <w:sz w:val="18"/>
                 <w:szCs w:val="18"/>
               </w:rPr>
-              <w:t xml:space="preserve">No enumero módulos sueltos: agrupo por lo que resuelven. La administración usa el panel de WordPress y WooCommerce, que ya existía, sin programar uno nuevo.</w:t>
+              <w:t xml:space="preserve">C1: identidad y home. C2: catálogo, fichas, búsqueda y comparador. C3: el recorrido de cotización con WhatsApp, Dónde comprar, Mayoristas y Soporte. Verifiqué cada incremento y lo documenté con capturas; las pruebas formales están planificadas.</w:t>
             </w:r>
           </w:p>
         </w:tc>
@@ -8653,7 +8701,7 @@
                 <w:sz w:val="18"/>
                 <w:szCs w:val="18"/>
               </w:rPr>
-              <w:t xml:space="preserve">El comparador admite hasta 3 modelos y guarda la selección en el navegador durante 24 horas.</w:t>
+              <w:t xml:space="preserve">Se verificó que el comparador rechaza un cuarto producto y conserva la selección al cambiar de página.</w:t>
             </w:r>
           </w:p>
         </w:tc>
@@ -8721,7 +8769,7 @@
                 <w:sz w:val="18"/>
                 <w:szCs w:val="18"/>
               </w:rPr>
-              <w:t xml:space="preserve">Rediseño</w:t>
+              <w:t xml:space="preserve">Incremento</w:t>
             </w:r>
             <w:r>
               <w:rPr>
@@ -8737,7 +8785,7 @@
                 <w:sz w:val="18"/>
                 <w:szCs w:val="18"/>
               </w:rPr>
-              <w:t xml:space="preserve">Catálogo</w:t>
+              <w:t xml:space="preserve">Integración</w:t>
             </w:r>
             <w:r>
               <w:rPr>
@@ -8753,7 +8801,23 @@
                 <w:sz w:val="18"/>
                 <w:szCs w:val="18"/>
               </w:rPr>
-              <w:t xml:space="preserve">Recorrido comercial</w:t>
+              <w:t xml:space="preserve">Verificación</w:t>
+            </w:r>
+            <w:r>
+              <w:rPr>
+                <w:sz w:val="18"/>
+                <w:szCs w:val="18"/>
+              </w:rPr>
+              <w:t xml:space="preserve">  ·  </w:t>
+            </w:r>
+            <w:r>
+              <w:rPr>
+                <w:b/>
+                <w:bCs/>
+                <w:sz w:val="18"/>
+                <w:szCs w:val="18"/>
+              </w:rPr>
+              <w:t xml:space="preserve">IOC</w:t>
             </w:r>
           </w:p>
         </w:tc>
@@ -8821,19 +8885,19 @@
                 <w:sz w:val="18"/>
                 <w:szCs w:val="18"/>
               </w:rPr>
-              <w:t xml:space="preserve">¿Qué funciones siguen pendientes?</w:t>
-            </w:r>
-          </w:p>
-          <w:p>
-            <w:pPr>
-              <w:spacing w:after="30" w:line="250"/>
-            </w:pPr>
-            <w:r>
-              <w:rPr>
-                <w:sz w:val="18"/>
-                <w:szCs w:val="18"/>
-              </w:rPr>
-              <w:t xml:space="preserve">El registro de consultas, el directorio estructurado, los reportes y la auditoría: son ampliaciones propuestas.</w:t>
+              <w:t xml:space="preserve">¿Qué pruebas hizo?</w:t>
+            </w:r>
+          </w:p>
+          <w:p>
+            <w:pPr>
+              <w:spacing w:after="30" w:line="250"/>
+            </w:pPr>
+            <w:r>
+              <w:rPr>
+                <w:sz w:val="18"/>
+                <w:szCs w:val="18"/>
+              </w:rPr>
+              <w:t xml:space="preserve">Verificaciones funcionales documentadas con capturas. Las pruebas unitarias y de aceptación formales están planificadas, no ejecutadas.</w:t>
             </w:r>
           </w:p>
         </w:tc>
@@ -8901,7 +8965,7 @@
                 <w:sz w:val="20"/>
                 <w:szCs w:val="20"/>
               </w:rPr>
-              <w:t xml:space="preserve">¿Qué es RUP y por qué se utiliza?</w:t>
+              <w:t xml:space="preserve">Fase de Transición</w:t>
             </w:r>
             <w:r>
               <w:rPr>
@@ -8909,7 +8973,7 @@
                 <w:sz w:val="17"/>
                 <w:szCs w:val="17"/>
               </w:rPr>
-              <w:t xml:space="preserve">   ·  60 s</w:t>
+              <w:t xml:space="preserve">   ·  50 s</w:t>
             </w:r>
           </w:p>
         </w:tc>
@@ -8975,7 +9039,7 @@
                 <w:sz w:val="18"/>
                 <w:szCs w:val="18"/>
               </w:rPr>
-              <w:t xml:space="preserve">RUP es una metodología iterativa, dirigida por casos de uso y centrada en la arquitectura; encaja con un proyecto que se construye por partes.</w:t>
+              <w:t xml:space="preserve">Transición es la entrega a Black Hawk: validar, publicar, capacitar y mantener. Está planificada.</w:t>
             </w:r>
           </w:p>
         </w:tc>
@@ -9041,7 +9105,7 @@
                 <w:sz w:val="18"/>
                 <w:szCs w:val="18"/>
               </w:rPr>
-              <w:t xml:space="preserve">La web renovada no se hizo de una vez: primero la home y la identidad, luego el catálogo y la ficha, después el recorrido de cotización. Cada parte se diseñó, construyó y verificó.</w:t>
+              <w:t xml:space="preserve">La web renovada funciona en un entorno de prueba; falta validarla con la empresa, publicarla en su dominio con respaldo previo y capacitar al gestor. El hito PR es la publicación del producto.</w:t>
             </w:r>
           </w:p>
         </w:tc>
@@ -9107,7 +9171,7 @@
                 <w:sz w:val="18"/>
                 <w:szCs w:val="18"/>
               </w:rPr>
-              <w:t xml:space="preserve">El caso de uso «Cotizar por WhatsApp» guió el diseño de la ficha, del mensaje y de las pruebas.</w:t>
+              <w:t xml:space="preserve">Al publicarla en blackhawkcaraudio.com se podrá medir su uso con datos reales.</w:t>
             </w:r>
           </w:p>
         </w:tc>
@@ -9175,7 +9239,7 @@
                 <w:sz w:val="18"/>
                 <w:szCs w:val="18"/>
               </w:rPr>
-              <w:t xml:space="preserve">Iterativo</w:t>
+              <w:t xml:space="preserve">Aceptación</w:t>
             </w:r>
             <w:r>
               <w:rPr>
@@ -9191,7 +9255,7 @@
                 <w:sz w:val="18"/>
                 <w:szCs w:val="18"/>
               </w:rPr>
-              <w:t xml:space="preserve">Casos de uso</w:t>
+              <w:t xml:space="preserve">Despliegue</w:t>
             </w:r>
             <w:r>
               <w:rPr>
@@ -9207,7 +9271,23 @@
                 <w:sz w:val="18"/>
                 <w:szCs w:val="18"/>
               </w:rPr>
-              <w:t xml:space="preserve">Arquitectura</w:t>
+              <w:t xml:space="preserve">Capacitación</w:t>
+            </w:r>
+            <w:r>
+              <w:rPr>
+                <w:sz w:val="18"/>
+                <w:szCs w:val="18"/>
+              </w:rPr>
+              <w:t xml:space="preserve">  ·  </w:t>
+            </w:r>
+            <w:r>
+              <w:rPr>
+                <w:b/>
+                <w:bCs/>
+                <w:sz w:val="18"/>
+                <w:szCs w:val="18"/>
+              </w:rPr>
+              <w:t xml:space="preserve">PR</w:t>
             </w:r>
           </w:p>
         </w:tc>
@@ -9275,19 +9355,19 @@
                 <w:sz w:val="18"/>
                 <w:szCs w:val="18"/>
               </w:rPr>
-              <w:t xml:space="preserve">¿Por qué RUP y no Scrum?</w:t>
-            </w:r>
-          </w:p>
-          <w:p>
-            <w:pPr>
-              <w:spacing w:after="30" w:line="250"/>
-            </w:pPr>
-            <w:r>
-              <w:rPr>
-                <w:sz w:val="18"/>
-                <w:szCs w:val="18"/>
-              </w:rPr>
-              <w:t xml:space="preserve">Porque el curso exige análisis y diseño formales con UML, y RUP combina iteraciones con hitos y artefactos de modelado.</w:t>
+              <w:t xml:space="preserve">¿Cuándo se considera terminado el proyecto?</w:t>
+            </w:r>
+          </w:p>
+          <w:p>
+            <w:pPr>
+              <w:spacing w:after="30" w:line="250"/>
+            </w:pPr>
+            <w:r>
+              <w:rPr>
+                <w:sz w:val="18"/>
+                <w:szCs w:val="18"/>
+              </w:rPr>
+              <w:t xml:space="preserve">Cuando Black Hawk acepta la web, se publica en su dominio y el gestor queda capacitado: el hito PR.</w:t>
             </w:r>
           </w:p>
         </w:tc>
@@ -9355,7 +9435,7 @@
                 <w:sz w:val="20"/>
                 <w:szCs w:val="20"/>
               </w:rPr>
-              <w:t xml:space="preserve">Estructura general de RUP</w:t>
+              <w:t xml:space="preserve">Disciplinas, iteraciones y entregables</w:t>
             </w:r>
             <w:r>
               <w:rPr>
@@ -9363,7 +9443,7 @@
                 <w:sz w:val="17"/>
                 <w:szCs w:val="17"/>
               </w:rPr>
-              <w:t xml:space="preserve">   ·  65 s</w:t>
+              <w:t xml:space="preserve">   ·  60 s</w:t>
             </w:r>
           </w:p>
         </w:tc>
@@ -9429,7 +9509,7 @@
                 <w:sz w:val="18"/>
                 <w:szCs w:val="18"/>
               </w:rPr>
-              <w:t xml:space="preserve">RUP tiene dos dimensiones: en el tiempo, fases e iteraciones; en el contenido, disciplinas.</w:t>
+              <w:t xml:space="preserve">Esta matriz muestra qué se produjo en cada iteración y qué está realizado, en curso o planificado.</w:t>
             </w:r>
           </w:p>
         </w:tc>
@@ -9495,7 +9575,7 @@
                 <w:sz w:val="18"/>
                 <w:szCs w:val="18"/>
               </w:rPr>
-              <w:t xml:space="preserve">Las columnas son las fases, con sus iteraciones. Las filas son las disciplinas. La barra indica cuánto trabajo tiene cada disciplina en cada fase: requisitos pesa más al inicio, implementación en construcción. Todas conviven: no es una cascada.</w:t>
+              <w:t xml:space="preserve">Las columnas son las siete iteraciones; las filas, las disciplinas de ingeniería. Cada celda es el entregable principal. Se ve el carácter iterativo: requisitos y diseño aparecen varias veces, y la implementación empieza con un prototipo en Elaboración.</w:t>
             </w:r>
           </w:p>
         </w:tc>
@@ -9561,7 +9641,7 @@
                 <w:sz w:val="18"/>
                 <w:szCs w:val="18"/>
               </w:rPr>
-              <w:t xml:space="preserve">En Elaboración ya se programó un prototipo, y en Construcción se ajustaron requisitos.</w:t>
+              <w:t xml:space="preserve">C2 produjo el catálogo, la ficha y el comparador; C3 está en curso por las ampliaciones.</w:t>
             </w:r>
           </w:p>
         </w:tc>
@@ -9629,7 +9709,7 @@
                 <w:sz w:val="18"/>
                 <w:szCs w:val="18"/>
               </w:rPr>
-              <w:t xml:space="preserve">Fase</w:t>
+              <w:t xml:space="preserve">Iteración</w:t>
             </w:r>
             <w:r>
               <w:rPr>
@@ -9645,7 +9725,7 @@
                 <w:sz w:val="18"/>
                 <w:szCs w:val="18"/>
               </w:rPr>
-              <w:t xml:space="preserve">Iteración</w:t>
+              <w:t xml:space="preserve">Entregable</w:t>
             </w:r>
             <w:r>
               <w:rPr>
@@ -9661,23 +9741,7 @@
                 <w:sz w:val="18"/>
                 <w:szCs w:val="18"/>
               </w:rPr>
-              <w:t xml:space="preserve">Disciplina</w:t>
-            </w:r>
-            <w:r>
-              <w:rPr>
-                <w:sz w:val="18"/>
-                <w:szCs w:val="18"/>
-              </w:rPr>
-              <w:t xml:space="preserve">  ·  </w:t>
-            </w:r>
-            <w:r>
-              <w:rPr>
-                <w:b/>
-                <w:bCs/>
-                <w:sz w:val="18"/>
-                <w:szCs w:val="18"/>
-              </w:rPr>
-              <w:t xml:space="preserve">Hito</w:t>
+              <w:t xml:space="preserve">Estado</w:t>
             </w:r>
           </w:p>
         </w:tc>
@@ -9745,19 +9809,19 @@
                 <w:sz w:val="18"/>
                 <w:szCs w:val="18"/>
               </w:rPr>
-              <w:t xml:space="preserve">¿Qué diferencia hay entre fase y disciplina?</w:t>
-            </w:r>
-          </w:p>
-          <w:p>
-            <w:pPr>
-              <w:spacing w:after="30" w:line="250"/>
-            </w:pPr>
-            <w:r>
-              <w:rPr>
-                <w:sz w:val="18"/>
-                <w:szCs w:val="18"/>
-              </w:rPr>
-              <w:t xml:space="preserve">La fase es un periodo con un objetivo y un hito; la disciplina es un tipo de trabajo (requisitos, pruebas…) que ocurre en varias fases.</w:t>
+              <w:t xml:space="preserve">¿Por qué la implementación aparece en Elaboración?</w:t>
+            </w:r>
+          </w:p>
+          <w:p>
+            <w:pPr>
+              <w:spacing w:after="30" w:line="250"/>
+            </w:pPr>
+            <w:r>
+              <w:rPr>
+                <w:sz w:val="18"/>
+                <w:szCs w:val="18"/>
+              </w:rPr>
+              <w:t xml:space="preserve">Porque en RUP se construye un prototipo para validar la arquitectura antes de la construcción completa.</w:t>
             </w:r>
           </w:p>
         </w:tc>
@@ -9825,7 +9889,7 @@
                 <w:sz w:val="20"/>
                 <w:szCs w:val="20"/>
               </w:rPr>
-              <w:t xml:space="preserve">Fase de Inicio</w:t>
+              <w:t xml:space="preserve">Requisitos funcionales y no funcionales</w:t>
             </w:r>
             <w:r>
               <w:rPr>
@@ -9833,7 +9897,7 @@
                 <w:sz w:val="17"/>
                 <w:szCs w:val="17"/>
               </w:rPr>
-              <w:t xml:space="preserve">   ·  60 s</w:t>
+              <w:t xml:space="preserve">   ·  55 s</w:t>
             </w:r>
           </w:p>
         </w:tc>
@@ -9899,7 +9963,7 @@
                 <w:sz w:val="18"/>
                 <w:szCs w:val="18"/>
               </w:rPr>
-              <w:t xml:space="preserve">En Inicio entendí el negocio y acordé qué construir. Está realizada.</w:t>
+              <w:t xml:space="preserve">Los requisitos dicen qué hace la web renovada y con qué calidad; cada uno se enlaza con el catálogo completo.</w:t>
             </w:r>
           </w:p>
         </w:tc>
@@ -9965,7 +10029,7 @@
                 <w:sz w:val="18"/>
                 <w:szCs w:val="18"/>
               </w:rPr>
-              <w:t xml:space="preserve">Analicé el sitio original con capturas, identifiqué a los interesados y las necesidades, y fijé el alcance y las exclusiones. El hito LCO significa que los objetivos y el alcance quedan acordados.</w:t>
+              <w:t xml:space="preserve">Funcionales: explorar, buscar, ver la ficha, comparar, cotizar y consultar dónde comprar ya están desarrollados; registrar la consulta, el directorio y los reportes son propuestos. No funcionales: celular, usabilidad, peso de página, idioma y datos personales.</w:t>
             </w:r>
           </w:p>
         </w:tc>
@@ -10031,7 +10095,7 @@
                 <w:sz w:val="18"/>
                 <w:szCs w:val="18"/>
               </w:rPr>
-              <w:t xml:space="preserve">La tienda vacía y la ficha sin consulta se documentaron en esta fase.</w:t>
+              <w:t xml:space="preserve">Requisito no funcional medido: la ficha del BH-SW12XXG pasó de 5,28 MB a 0,38 MB transferidos en escritorio.</w:t>
             </w:r>
           </w:p>
         </w:tc>
@@ -10099,7 +10163,7 @@
                 <w:sz w:val="18"/>
                 <w:szCs w:val="18"/>
               </w:rPr>
-              <w:t xml:space="preserve">Visión</w:t>
+              <w:t xml:space="preserve">Funcional</w:t>
             </w:r>
             <w:r>
               <w:rPr>
@@ -10115,7 +10179,7 @@
                 <w:sz w:val="18"/>
                 <w:szCs w:val="18"/>
               </w:rPr>
-              <w:t xml:space="preserve">Stakeholders</w:t>
+              <w:t xml:space="preserve">No funcional</w:t>
             </w:r>
             <w:r>
               <w:rPr>
@@ -10131,23 +10195,7 @@
                 <w:sz w:val="18"/>
                 <w:szCs w:val="18"/>
               </w:rPr>
-              <w:t xml:space="preserve">Viabilidad</w:t>
-            </w:r>
-            <w:r>
-              <w:rPr>
-                <w:sz w:val="18"/>
-                <w:szCs w:val="18"/>
-              </w:rPr>
-              <w:t xml:space="preserve">  ·  </w:t>
-            </w:r>
-            <w:r>
-              <w:rPr>
-                <w:b/>
-                <w:bCs/>
-                <w:sz w:val="18"/>
-                <w:szCs w:val="18"/>
-              </w:rPr>
-              <w:t xml:space="preserve">LCO</w:t>
+              <w:t xml:space="preserve">Criterio de aceptación</w:t>
             </w:r>
           </w:p>
         </w:tc>
@@ -10215,19 +10263,19 @@
                 <w:sz w:val="18"/>
                 <w:szCs w:val="18"/>
               </w:rPr>
-              <w:t xml:space="preserve">¿Qué se entrega al terminar Inicio?</w:t>
-            </w:r>
-          </w:p>
-          <w:p>
-            <w:pPr>
-              <w:spacing w:after="30" w:line="250"/>
-            </w:pPr>
-            <w:r>
-              <w:rPr>
-                <w:sz w:val="18"/>
-                <w:szCs w:val="18"/>
-              </w:rPr>
-              <w:t xml:space="preserve">La visión, el análisis del sitio original, el modelo del negocio y los riesgos iniciales.</w:t>
+              <w:t xml:space="preserve">¿Cómo se valida un requisito?</w:t>
+            </w:r>
+          </w:p>
+          <w:p>
+            <w:pPr>
+              <w:spacing w:after="30" w:line="250"/>
+            </w:pPr>
+            <w:r>
+              <w:rPr>
+                <w:sz w:val="18"/>
+                <w:szCs w:val="18"/>
+              </w:rPr>
+              <w:t xml:space="preserve">Con su criterio de aceptación: por ejemplo, el comparador debe rechazar un cuarto producto.</w:t>
             </w:r>
           </w:p>
         </w:tc>
@@ -10295,7 +10343,7 @@
                 <w:sz w:val="20"/>
                 <w:szCs w:val="20"/>
               </w:rPr>
-              <w:t xml:space="preserve">Fase de Elaboración</w:t>
+              <w:t xml:space="preserve">Diagrama de casos de uso</w:t>
             </w:r>
             <w:r>
               <w:rPr>
@@ -10369,7 +10417,7 @@
                 <w:sz w:val="18"/>
                 <w:szCs w:val="18"/>
               </w:rPr>
-              <w:t xml:space="preserve">En Elaboración definí requisitos, modelé con UML y validé la arquitectura. Está realizada.</w:t>
+              <w:t xml:space="preserve">Qué puede hacer cada actor con la web renovada.</w:t>
             </w:r>
           </w:p>
         </w:tc>
@@ -10435,7 +10483,7 @@
                 <w:sz w:val="18"/>
                 <w:szCs w:val="18"/>
               </w:rPr>
-              <w:t xml:space="preserve">Aquí se decide cómo será el sistema antes de construirlo: requisitos, casos de uso, diagramas, arquitectura y prototipos. La decisión clave fue rediseñar sobre la misma plataforma con un tema hijo. El hito LCA indica que la arquitectura está validada.</w:t>
+              <w:t xml:space="preserve">Los actores externos están a la izquierda y el gestor a la derecha; WhatsApp es un sistema externo. El cliente interesado hereda lo que hace el visitante. «Cotizar por WhatsApp» incluiría registrar la consulta, que es una ampliación propuesta.</w:t>
             </w:r>
           </w:p>
         </w:tc>
@@ -10501,7 +10549,7 @@
                 <w:sz w:val="18"/>
                 <w:szCs w:val="18"/>
               </w:rPr>
-              <w:t xml:space="preserve">Antes de construir se definió cómo serían la home, el catálogo, la ficha y el comparador, y cómo se conectarían con WooCommerce.</w:t>
+              <w:t xml:space="preserve">CU-05 Comparar productos y CU-08 Cotizar por WhatsApp ya funcionan en la web renovada.</w:t>
             </w:r>
           </w:p>
         </w:tc>
@@ -10569,7 +10617,7 @@
                 <w:sz w:val="18"/>
                 <w:szCs w:val="18"/>
               </w:rPr>
-              <w:t xml:space="preserve">Requisitos</w:t>
+              <w:t xml:space="preserve">Actor</w:t>
             </w:r>
             <w:r>
               <w:rPr>
@@ -10585,7 +10633,7 @@
                 <w:sz w:val="18"/>
                 <w:szCs w:val="18"/>
               </w:rPr>
-              <w:t xml:space="preserve">Casos de uso</w:t>
+              <w:t xml:space="preserve">Caso de uso</w:t>
             </w:r>
             <w:r>
               <w:rPr>
@@ -10601,7 +10649,7 @@
                 <w:sz w:val="18"/>
                 <w:szCs w:val="18"/>
               </w:rPr>
-              <w:t xml:space="preserve">Arquitectura</w:t>
+              <w:t xml:space="preserve">«include»</w:t>
             </w:r>
             <w:r>
               <w:rPr>
@@ -10617,7 +10665,7 @@
                 <w:sz w:val="18"/>
                 <w:szCs w:val="18"/>
               </w:rPr>
-              <w:t xml:space="preserve">LCA</w:t>
+              <w:t xml:space="preserve">«extend»</w:t>
             </w:r>
           </w:p>
         </w:tc>
@@ -10685,19 +10733,19 @@
                 <w:sz w:val="18"/>
                 <w:szCs w:val="18"/>
               </w:rPr>
-              <w:t xml:space="preserve">¿Por qué no reescribir la web desde cero?</w:t>
-            </w:r>
-          </w:p>
-          <w:p>
-            <w:pPr>
-              <w:spacing w:after="30" w:line="250"/>
-            </w:pPr>
-            <w:r>
-              <w:rPr>
-                <w:sz w:val="18"/>
-                <w:szCs w:val="18"/>
-              </w:rPr>
-              <w:t xml:space="preserve">Porque la plataforma ya tenía el catálogo y el equipo sabe usarla; rediseñar sobre ella es más barato y menos riesgoso.</w:t>
+              <w:t xml:space="preserve">¿Qué diferencia hay entre actor y usuario?</w:t>
+            </w:r>
+          </w:p>
+          <w:p>
+            <w:pPr>
+              <w:spacing w:after="30" w:line="250"/>
+            </w:pPr>
+            <w:r>
+              <w:rPr>
+                <w:sz w:val="18"/>
+                <w:szCs w:val="18"/>
+              </w:rPr>
+              <w:t xml:space="preserve">El actor es un rol: una misma persona puede ser visitante y luego cliente interesado. WhatsApp también es un actor, porque es un sistema externo.</w:t>
             </w:r>
           </w:p>
         </w:tc>
@@ -10765,7 +10813,7 @@
                 <w:sz w:val="20"/>
                 <w:szCs w:val="20"/>
               </w:rPr>
-              <w:t xml:space="preserve">Fase de Construcción</w:t>
+              <w:t xml:space="preserve">Diagrama de actividades</w:t>
             </w:r>
             <w:r>
               <w:rPr>
@@ -10773,7 +10821,7 @@
                 <w:sz w:val="17"/>
                 <w:szCs w:val="17"/>
               </w:rPr>
-              <w:t xml:space="preserve">   ·  65 s</w:t>
+              <w:t xml:space="preserve">   ·  55 s</w:t>
             </w:r>
           </w:p>
         </w:tc>
@@ -10839,7 +10887,7 @@
                 <w:sz w:val="18"/>
                 <w:szCs w:val="18"/>
               </w:rPr>
-              <w:t xml:space="preserve">En Construcción desarrollé la web renovada por incrementos. Está en curso: el rediseño funciona; las ampliaciones están planificadas.</w:t>
+              <w:t xml:space="preserve">Cómo avanza el recorrido comercial, paso a paso, y quién hace cada paso.</w:t>
             </w:r>
           </w:p>
         </w:tc>
@@ -10905,7 +10953,7 @@
                 <w:sz w:val="18"/>
                 <w:szCs w:val="18"/>
               </w:rPr>
-              <w:t xml:space="preserve">C1: identidad y home. C2: catálogo, fichas, búsqueda y comparador. C3: el recorrido de cotización con WhatsApp, Dónde comprar, Mayoristas y Soporte. Verifiqué cada incremento y lo documenté con capturas; las pruebas formales están planificadas.</w:t>
+              <w:t xml:space="preserve">Tres calles: el cliente, la web renovada y el área comercial o distribuidor. Las decisiones son rombos: si conoce el modelo, si quiere comparar, si tiene intención de compra. La acción en morado (registrar la consulta) es la ampliación.</w:t>
             </w:r>
           </w:p>
         </w:tc>
@@ -10971,7 +11019,7 @@
                 <w:sz w:val="18"/>
                 <w:szCs w:val="18"/>
               </w:rPr>
-              <w:t xml:space="preserve">Se verificó que el comparador rechaza un cuarto producto y conserva la selección al cambiar de página.</w:t>
+              <w:t xml:space="preserve">Si el cliente no conoce el modelo, explora y filtra el catálogo; si lo conoce, lo busca directamente.</w:t>
             </w:r>
           </w:p>
         </w:tc>
@@ -11039,7 +11087,7 @@
                 <w:sz w:val="18"/>
                 <w:szCs w:val="18"/>
               </w:rPr>
-              <w:t xml:space="preserve">Incremento</w:t>
+              <w:t xml:space="preserve">Calle</w:t>
             </w:r>
             <w:r>
               <w:rPr>
@@ -11055,7 +11103,7 @@
                 <w:sz w:val="18"/>
                 <w:szCs w:val="18"/>
               </w:rPr>
-              <w:t xml:space="preserve">Integración</w:t>
+              <w:t xml:space="preserve">Decisión</w:t>
             </w:r>
             <w:r>
               <w:rPr>
@@ -11071,23 +11119,7 @@
                 <w:sz w:val="18"/>
                 <w:szCs w:val="18"/>
               </w:rPr>
-              <w:t xml:space="preserve">Verificación</w:t>
-            </w:r>
-            <w:r>
-              <w:rPr>
-                <w:sz w:val="18"/>
-                <w:szCs w:val="18"/>
-              </w:rPr>
-              <w:t xml:space="preserve">  ·  </w:t>
-            </w:r>
-            <w:r>
-              <w:rPr>
-                <w:b/>
-                <w:bCs/>
-                <w:sz w:val="18"/>
-                <w:szCs w:val="18"/>
-              </w:rPr>
-              <w:t xml:space="preserve">IOC</w:t>
+              <w:t xml:space="preserve">Flujo</w:t>
             </w:r>
           </w:p>
         </w:tc>
@@ -11155,19 +11187,19 @@
                 <w:sz w:val="18"/>
                 <w:szCs w:val="18"/>
               </w:rPr>
-              <w:t xml:space="preserve">¿Qué pruebas hizo?</w:t>
-            </w:r>
-          </w:p>
-          <w:p>
-            <w:pPr>
-              <w:spacing w:after="30" w:line="250"/>
-            </w:pPr>
-            <w:r>
-              <w:rPr>
-                <w:sz w:val="18"/>
-                <w:szCs w:val="18"/>
-              </w:rPr>
-              <w:t xml:space="preserve">Verificaciones funcionales documentadas con capturas. Las pruebas unitarias y de aceptación formales están planificadas, no ejecutadas.</w:t>
+              <w:t xml:space="preserve">¿Dónde termina el sistema?</w:t>
+            </w:r>
+          </w:p>
+          <w:p>
+            <w:pPr>
+              <w:spacing w:after="30" w:line="250"/>
+            </w:pPr>
+            <w:r>
+              <w:rPr>
+                <w:sz w:val="18"/>
+                <w:szCs w:val="18"/>
+              </w:rPr>
+              <w:t xml:space="preserve">Al abrir WhatsApp: la atención y la orientación al punto de venta ocurren fuera de la web.</w:t>
             </w:r>
           </w:p>
         </w:tc>
@@ -11235,7 +11267,7 @@
                 <w:sz w:val="20"/>
                 <w:szCs w:val="20"/>
               </w:rPr>
-              <w:t xml:space="preserve">Fase de Transición</w:t>
+              <w:t xml:space="preserve">Diagrama de secuencia</w:t>
             </w:r>
             <w:r>
               <w:rPr>
@@ -11243,7 +11275,7 @@
                 <w:sz w:val="17"/>
                 <w:szCs w:val="17"/>
               </w:rPr>
-              <w:t xml:space="preserve">   ·  50 s</w:t>
+              <w:t xml:space="preserve">   ·  60 s</w:t>
             </w:r>
           </w:p>
         </w:tc>
@@ -11309,7 +11341,7 @@
                 <w:sz w:val="18"/>
                 <w:szCs w:val="18"/>
               </w:rPr>
-              <w:t xml:space="preserve">Transición es la entrega a Black Hawk: validar, publicar, capacitar y mantener. Está planificada.</w:t>
+              <w:t xml:space="preserve">Cómo interactúan los componentes cuando el cliente consulta un producto por WhatsApp.</w:t>
             </w:r>
           </w:p>
         </w:tc>
@@ -11375,7 +11407,7 @@
                 <w:sz w:val="18"/>
                 <w:szCs w:val="18"/>
               </w:rPr>
-              <w:t xml:space="preserve">La web renovada funciona en un entorno de prueba; falta validarla con la empresa, publicarla en su dominio con respaldo previo y capacitar al gestor. El hito PR es la publicación del producto.</w:t>
+              <w:t xml:space="preserve">Se lee de arriba hacia abajo, en el orden de los mensajes. La ficha pide el producto a WooCommerce, arma el mensaje con el modelo y abre WhatsApp. El recuadro morado es la ampliación: registrar el inicio de la consulta sin demorar la apertura.</w:t>
             </w:r>
           </w:p>
         </w:tc>
@@ -11441,7 +11473,7 @@
                 <w:sz w:val="18"/>
                 <w:szCs w:val="18"/>
               </w:rPr>
-              <w:t xml:space="preserve">Al publicarla en blackhawkcaraudio.com se podrá medir su uso con datos reales.</w:t>
+              <w:t xml:space="preserve">El mensaje 8 arma «quiero cotizar el modelo BH-SW12XXG».</w:t>
             </w:r>
           </w:p>
         </w:tc>
@@ -11509,7 +11541,7 @@
                 <w:sz w:val="18"/>
                 <w:szCs w:val="18"/>
               </w:rPr>
-              <w:t xml:space="preserve">Aceptación</w:t>
+              <w:t xml:space="preserve">Línea de vida</w:t>
             </w:r>
             <w:r>
               <w:rPr>
@@ -11525,7 +11557,7 @@
                 <w:sz w:val="18"/>
                 <w:szCs w:val="18"/>
               </w:rPr>
-              <w:t xml:space="preserve">Despliegue</w:t>
+              <w:t xml:space="preserve">Mensaje</w:t>
             </w:r>
             <w:r>
               <w:rPr>
@@ -11541,23 +11573,7 @@
                 <w:sz w:val="18"/>
                 <w:szCs w:val="18"/>
               </w:rPr>
-              <w:t xml:space="preserve">Capacitación</w:t>
-            </w:r>
-            <w:r>
-              <w:rPr>
-                <w:sz w:val="18"/>
-                <w:szCs w:val="18"/>
-              </w:rPr>
-              <w:t xml:space="preserve">  ·  </w:t>
-            </w:r>
-            <w:r>
-              <w:rPr>
-                <w:b/>
-                <w:bCs/>
-                <w:sz w:val="18"/>
-                <w:szCs w:val="18"/>
-              </w:rPr>
-              <w:t xml:space="preserve">PR</w:t>
+              <w:t xml:space="preserve">Fragmento</w:t>
             </w:r>
           </w:p>
         </w:tc>
@@ -11625,19 +11641,19 @@
                 <w:sz w:val="18"/>
                 <w:szCs w:val="18"/>
               </w:rPr>
-              <w:t xml:space="preserve">¿Cuándo se considera terminado el proyecto?</w:t>
-            </w:r>
-          </w:p>
-          <w:p>
-            <w:pPr>
-              <w:spacing w:after="30" w:line="250"/>
-            </w:pPr>
-            <w:r>
-              <w:rPr>
-                <w:sz w:val="18"/>
-                <w:szCs w:val="18"/>
-              </w:rPr>
-              <w:t xml:space="preserve">Cuando Black Hawk acepta la web, se publica en su dominio y el gestor queda capacitado: el hito PR.</w:t>
+              <w:t xml:space="preserve">¿El sistema guarda la conversación?</w:t>
+            </w:r>
+          </w:p>
+          <w:p>
+            <w:pPr>
+              <w:spacing w:after="30" w:line="250"/>
+            </w:pPr>
+            <w:r>
+              <w:rPr>
+                <w:sz w:val="18"/>
+                <w:szCs w:val="18"/>
+              </w:rPr>
+              <w:t xml:space="preserve">No. Solo abriría un registro del inicio (ampliación); la conversación ocurre en WhatsApp.</w:t>
             </w:r>
           </w:p>
         </w:tc>
@@ -11705,7 +11721,7 @@
                 <w:sz w:val="20"/>
                 <w:szCs w:val="20"/>
               </w:rPr>
-              <w:t xml:space="preserve">Disciplinas, iteraciones y entregables</w:t>
+              <w:t xml:space="preserve">Diagrama de clases</w:t>
             </w:r>
             <w:r>
               <w:rPr>
@@ -11713,7 +11729,7 @@
                 <w:sz w:val="17"/>
                 <w:szCs w:val="17"/>
               </w:rPr>
-              <w:t xml:space="preserve">   ·  60 s</w:t>
+              <w:t xml:space="preserve">   ·  55 s</w:t>
             </w:r>
           </w:p>
         </w:tc>
@@ -11779,7 +11795,7 @@
                 <w:sz w:val="18"/>
                 <w:szCs w:val="18"/>
               </w:rPr>
-              <w:t xml:space="preserve">Esta matriz muestra qué se produjo en cada iteración y qué está realizado, en curso o planificado.</w:t>
+              <w:t xml:space="preserve">Cómo se estructura la información del sistema.</w:t>
             </w:r>
           </w:p>
         </w:tc>
@@ -11845,7 +11861,7 @@
                 <w:sz w:val="18"/>
                 <w:szCs w:val="18"/>
               </w:rPr>
-              <w:t xml:space="preserve">Las columnas son las siete iteraciones; las filas, las disciplinas de ingeniería. Cada celda es el entregable principal. Se ve el carácter iterativo: requisitos y diseño aparecen varias veces, y la implementación empieza con un prototipo en Elaboración.</w:t>
+              <w:t xml:space="preserve">El producto es el centro: pertenece a una o más categorías y se compone de especificaciones e imágenes. Las clases en morado son propuestas: el evento de consulta registra que se inició una consulta, y el distribuidor forma el directorio.</w:t>
             </w:r>
           </w:p>
         </w:tc>
@@ -11911,7 +11927,7 @@
                 <w:sz w:val="18"/>
                 <w:szCs w:val="18"/>
               </w:rPr>
-              <w:t xml:space="preserve">C2 produjo el catálogo, la ficha y el comparador; C3 está en curso por las ampliaciones.</w:t>
+              <w:t xml:space="preserve">Si se elimina el producto BH-SW12XXG, sus especificaciones desaparecen con él: eso es la composición.</w:t>
             </w:r>
           </w:p>
         </w:tc>
@@ -11979,7 +11995,7 @@
                 <w:sz w:val="18"/>
                 <w:szCs w:val="18"/>
               </w:rPr>
-              <w:t xml:space="preserve">Iteración</w:t>
+              <w:t xml:space="preserve">Clase</w:t>
             </w:r>
             <w:r>
               <w:rPr>
@@ -11995,7 +12011,7 @@
                 <w:sz w:val="18"/>
                 <w:szCs w:val="18"/>
               </w:rPr>
-              <w:t xml:space="preserve">Entregable</w:t>
+              <w:t xml:space="preserve">Asociación</w:t>
             </w:r>
             <w:r>
               <w:rPr>
@@ -12011,7 +12027,23 @@
                 <w:sz w:val="18"/>
                 <w:szCs w:val="18"/>
               </w:rPr>
-              <w:t xml:space="preserve">Estado</w:t>
+              <w:t xml:space="preserve">Multiplicidad</w:t>
+            </w:r>
+            <w:r>
+              <w:rPr>
+                <w:sz w:val="18"/>
+                <w:szCs w:val="18"/>
+              </w:rPr>
+              <w:t xml:space="preserve">  ·  </w:t>
+            </w:r>
+            <w:r>
+              <w:rPr>
+                <w:b/>
+                <w:bCs/>
+                <w:sz w:val="18"/>
+                <w:szCs w:val="18"/>
+              </w:rPr>
+              <w:t xml:space="preserve">Composición</w:t>
             </w:r>
           </w:p>
         </w:tc>
@@ -12079,19 +12111,19 @@
                 <w:sz w:val="18"/>
                 <w:szCs w:val="18"/>
               </w:rPr>
-              <w:t xml:space="preserve">¿Por qué la implementación aparece en Elaboración?</w:t>
-            </w:r>
-          </w:p>
-          <w:p>
-            <w:pPr>
-              <w:spacing w:after="30" w:line="250"/>
-            </w:pPr>
-            <w:r>
-              <w:rPr>
-                <w:sz w:val="18"/>
-                <w:szCs w:val="18"/>
-              </w:rPr>
-              <w:t xml:space="preserve">Porque en RUP se construye un prototipo para validar la arquitectura antes de la construcción completa.</w:t>
+              <w:t xml:space="preserve">¿Qué significa 1..*?</w:t>
+            </w:r>
+          </w:p>
+          <w:p>
+            <w:pPr>
+              <w:spacing w:after="30" w:line="250"/>
+            </w:pPr>
+            <w:r>
+              <w:rPr>
+                <w:sz w:val="18"/>
+                <w:szCs w:val="18"/>
+              </w:rPr>
+              <w:t xml:space="preserve">Uno o más: cada producto pertenece al menos a una categoría.</w:t>
             </w:r>
           </w:p>
         </w:tc>
@@ -12159,7 +12191,7 @@
                 <w:sz w:val="20"/>
                 <w:szCs w:val="20"/>
               </w:rPr>
-              <w:t xml:space="preserve">Requisitos funcionales y no funcionales</w:t>
+              <w:t xml:space="preserve">Arquitectura y componentes</w:t>
             </w:r>
             <w:r>
               <w:rPr>
@@ -12167,7 +12199,7 @@
                 <w:sz w:val="17"/>
                 <w:szCs w:val="17"/>
               </w:rPr>
-              <w:t xml:space="preserve">   ·  55 s</w:t>
+              <w:t xml:space="preserve">   ·  60 s</w:t>
             </w:r>
           </w:p>
         </w:tc>
@@ -12233,7 +12265,7 @@
                 <w:sz w:val="18"/>
                 <w:szCs w:val="18"/>
               </w:rPr>
-              <w:t xml:space="preserve">Los requisitos dicen qué hace la web renovada y con qué calidad; cada uno se enlaza con el catálogo completo.</w:t>
+              <w:t xml:space="preserve">Cómo está organizado técnicamente el sistema.</w:t>
             </w:r>
           </w:p>
         </w:tc>
@@ -12299,7 +12331,7 @@
                 <w:sz w:val="18"/>
                 <w:szCs w:val="18"/>
               </w:rPr>
-              <w:t xml:space="preserve">Funcionales: explorar, buscar, ver la ficha, comparar, cotizar y consultar dónde comprar ya están desarrollados; registrar la consulta, el directorio y los reportes son propuestos. No funcionales: celular, usabilidad, peso de página, idioma y datos personales.</w:t>
+              <w:t xml:space="preserve">El rediseño vive en el tema hijo: plantillas, páginas y el botón de WhatsApp. WooCommerce maneja los productos; YITH Catalog Mode oculta precio y carrito; todo corre sobre WordPress y MySQL. El módulo propio en morado alojaría las ampliaciones.</w:t>
             </w:r>
           </w:p>
         </w:tc>
@@ -12365,7 +12397,7 @@
                 <w:sz w:val="18"/>
                 <w:szCs w:val="18"/>
               </w:rPr>
-              <w:t xml:space="preserve">Requisito no funcional medido: la ficha del BH-SW12XXG pasó de 5,28 MB a 0,38 MB transferidos en escritorio.</w:t>
+              <w:t xml:space="preserve">Como el rediseño está en el tema hijo, actualizar WooCommerce no borra los cambios.</w:t>
             </w:r>
           </w:p>
         </w:tc>
@@ -12433,7 +12465,7 @@
                 <w:sz w:val="18"/>
                 <w:szCs w:val="18"/>
               </w:rPr>
-              <w:t xml:space="preserve">Funcional</w:t>
+              <w:t xml:space="preserve">Componente</w:t>
             </w:r>
             <w:r>
               <w:rPr>
@@ -12449,7 +12481,7 @@
                 <w:sz w:val="18"/>
                 <w:szCs w:val="18"/>
               </w:rPr>
-              <w:t xml:space="preserve">No funcional</w:t>
+              <w:t xml:space="preserve">Dependencia</w:t>
             </w:r>
             <w:r>
               <w:rPr>
@@ -12465,7 +12497,7 @@
                 <w:sz w:val="18"/>
                 <w:szCs w:val="18"/>
               </w:rPr>
-              <w:t xml:space="preserve">Criterio de aceptación</w:t>
+              <w:t xml:space="preserve">Tema hijo</w:t>
             </w:r>
           </w:p>
         </w:tc>
@@ -12533,19 +12565,19 @@
                 <w:sz w:val="18"/>
                 <w:szCs w:val="18"/>
               </w:rPr>
-              <w:t xml:space="preserve">¿Cómo se valida un requisito?</w:t>
-            </w:r>
-          </w:p>
-          <w:p>
-            <w:pPr>
-              <w:spacing w:after="30" w:line="250"/>
-            </w:pPr>
-            <w:r>
-              <w:rPr>
-                <w:sz w:val="18"/>
-                <w:szCs w:val="18"/>
-              </w:rPr>
-              <w:t xml:space="preserve">Con su criterio de aceptación: por ejemplo, el comparador debe rechazar un cuarto producto.</w:t>
+              <w:t xml:space="preserve">¿Dónde está su desarrollo?</w:t>
+            </w:r>
+          </w:p>
+          <w:p>
+            <w:pPr>
+              <w:spacing w:after="30" w:line="250"/>
+            </w:pPr>
+            <w:r>
+              <w:rPr>
+                <w:sz w:val="18"/>
+                <w:szCs w:val="18"/>
+              </w:rPr>
+              <w:t xml:space="preserve">En el tema hijo rozer-child: plantillas, estilos, scripts del buscador y del comparador, y las páginas nuevas.</w:t>
             </w:r>
           </w:p>
         </w:tc>
@@ -12613,7 +12645,7 @@
                 <w:sz w:val="20"/>
                 <w:szCs w:val="20"/>
               </w:rPr>
-              <w:t xml:space="preserve">Diagrama de casos de uso</w:t>
+              <w:t xml:space="preserve">El sistema renovado</w:t>
             </w:r>
             <w:r>
               <w:rPr>
@@ -12621,7 +12653,7 @@
                 <w:sz w:val="17"/>
                 <w:szCs w:val="17"/>
               </w:rPr>
-              <w:t xml:space="preserve">   ·  60 s</w:t>
+              <w:t xml:space="preserve">   ·  55 s</w:t>
             </w:r>
           </w:p>
         </w:tc>
@@ -12687,7 +12719,7 @@
                 <w:sz w:val="18"/>
                 <w:szCs w:val="18"/>
               </w:rPr>
-              <w:t xml:space="preserve">Qué puede hacer cada actor con la web renovada.</w:t>
+              <w:t xml:space="preserve">Lo que entrego a Black Hawk es la web renovada: rediseño, catálogo y recorrido comercial sobre la misma plataforma.</w:t>
             </w:r>
           </w:p>
         </w:tc>
@@ -12753,7 +12785,7 @@
                 <w:sz w:val="18"/>
                 <w:szCs w:val="18"/>
               </w:rPr>
-              <w:t xml:space="preserve">Los actores externos están a la izquierda y el gestor a la derecha; WhatsApp es un sistema externo. El cliente interesado hereda lo que hace el visitante. «Cotizar por WhatsApp» incluiría registrar la consulta, que es una ampliación propuesta.</w:t>
+              <w:t xml:space="preserve">Hay que separar tres cosas: el sitio original (punto de partida), la web renovada que desarrollo (la solución) y las ampliaciones que propongo (lo que viene después).</w:t>
             </w:r>
           </w:p>
         </w:tc>
@@ -12819,7 +12851,7 @@
                 <w:sz w:val="18"/>
                 <w:szCs w:val="18"/>
               </w:rPr>
-              <w:t xml:space="preserve">CU-05 Comparar productos y CU-08 Cotizar por WhatsApp ya funcionan en la web renovada.</w:t>
+              <w:t xml:space="preserve">La web renovada está construida como tema hijo sobre WordPress y WooCommerce y ya funciona en un entorno de prueba.</w:t>
             </w:r>
           </w:p>
         </w:tc>
@@ -12887,7 +12919,7 @@
                 <w:sz w:val="18"/>
                 <w:szCs w:val="18"/>
               </w:rPr>
-              <w:t xml:space="preserve">Actor</w:t>
+              <w:t xml:space="preserve">Original</w:t>
             </w:r>
             <w:r>
               <w:rPr>
@@ -12903,7 +12935,7 @@
                 <w:sz w:val="18"/>
                 <w:szCs w:val="18"/>
               </w:rPr>
-              <w:t xml:space="preserve">Caso de uso</w:t>
+              <w:t xml:space="preserve">Renovado</w:t>
             </w:r>
             <w:r>
               <w:rPr>
@@ -12919,23 +12951,7 @@
                 <w:sz w:val="18"/>
                 <w:szCs w:val="18"/>
               </w:rPr>
-              <w:t xml:space="preserve">«include»</w:t>
-            </w:r>
-            <w:r>
-              <w:rPr>
-                <w:sz w:val="18"/>
-                <w:szCs w:val="18"/>
-              </w:rPr>
-              <w:t xml:space="preserve">  ·  </w:t>
-            </w:r>
-            <w:r>
-              <w:rPr>
-                <w:b/>
-                <w:bCs/>
-                <w:sz w:val="18"/>
-                <w:szCs w:val="18"/>
-              </w:rPr>
-              <w:t xml:space="preserve">«extend»</w:t>
+              <w:t xml:space="preserve">Ampliaciones</w:t>
             </w:r>
           </w:p>
         </w:tc>
@@ -13003,19 +13019,19 @@
                 <w:sz w:val="18"/>
                 <w:szCs w:val="18"/>
               </w:rPr>
-              <w:t xml:space="preserve">¿Qué diferencia hay entre actor y usuario?</w:t>
-            </w:r>
-          </w:p>
-          <w:p>
-            <w:pPr>
-              <w:spacing w:after="30" w:line="250"/>
-            </w:pPr>
-            <w:r>
-              <w:rPr>
-                <w:sz w:val="18"/>
-                <w:szCs w:val="18"/>
-              </w:rPr>
-              <w:t xml:space="preserve">El actor es un rol: una misma persona puede ser visitante y luego cliente interesado. WhatsApp también es un actor, porque es un sistema externo.</w:t>
+              <w:t xml:space="preserve">¿Qué parte es su aporte?</w:t>
+            </w:r>
+          </w:p>
+          <w:p>
+            <w:pPr>
+              <w:spacing w:after="30" w:line="250"/>
+            </w:pPr>
+            <w:r>
+              <w:rPr>
+                <w:sz w:val="18"/>
+                <w:szCs w:val="18"/>
+              </w:rPr>
+              <w:t xml:space="preserve">El rediseño completo del sitio: identidad visual, catálogo, fichas, comparador y el recorrido de cotización. Las ampliaciones son propuestas.</w:t>
             </w:r>
           </w:p>
         </w:tc>
@@ -13083,7 +13099,7 @@
                 <w:sz w:val="20"/>
                 <w:szCs w:val="20"/>
               </w:rPr>
-              <w:t xml:space="preserve">Diagrama de actividades</w:t>
+              <w:t xml:space="preserve">Antes y después: home y catálogo</w:t>
             </w:r>
             <w:r>
               <w:rPr>
@@ -13091,7 +13107,7 @@
                 <w:sz w:val="17"/>
                 <w:szCs w:val="17"/>
               </w:rPr>
-              <w:t xml:space="preserve">   ·  55 s</w:t>
+              <w:t xml:space="preserve">   ·  70 s</w:t>
             </w:r>
           </w:p>
         </w:tc>
@@ -13157,7 +13173,7 @@
                 <w:sz w:val="18"/>
                 <w:szCs w:val="18"/>
               </w:rPr>
-              <w:t xml:space="preserve">Cómo avanza el recorrido comercial, paso a paso, y quién hace cada paso.</w:t>
+              <w:t xml:space="preserve">Comparo pantallas equivalentes: qué había, qué necesidad detecté, qué cambié y qué espero lograr.</w:t>
             </w:r>
           </w:p>
         </w:tc>
@@ -13223,7 +13239,7 @@
                 <w:sz w:val="18"/>
                 <w:szCs w:val="18"/>
               </w:rPr>
-              <w:t xml:space="preserve">Tres calles: el cliente, la web renovada y el área comercial o distribuidor. Las decisiones son rombos: si conoce el modelo, si quiere comparar, si tiene intención de compra. La acción en morado (registrar la consulta) es la ampliación.</w:t>
+              <w:t xml:space="preserve">Home: la marca ahora tiene jerarquía y el encabezado siempre ofrece buscar y cotizar. Catálogo: «Productos» ya no lleva a una tienda vacía; muestra los 118 productos con pestañas, contador y filtros.</w:t>
             </w:r>
           </w:p>
         </w:tc>
@@ -13289,7 +13305,7 @@
                 <w:sz w:val="18"/>
                 <w:szCs w:val="18"/>
               </w:rPr>
-              <w:t xml:space="preserve">Si el cliente no conoce el modelo, explora y filtra el catálogo; si lo conoce, lo busca directamente.</w:t>
+              <w:t xml:space="preserve">En el sitio original, al pulsar «Productos» aparecía «Tienda» sin productos; en la web renovada, el catálogo muestra 118.</w:t>
             </w:r>
           </w:p>
         </w:tc>
@@ -13357,7 +13373,7 @@
                 <w:sz w:val="18"/>
                 <w:szCs w:val="18"/>
               </w:rPr>
-              <w:t xml:space="preserve">Calle</w:t>
+              <w:t xml:space="preserve">Jerarquía visual</w:t>
             </w:r>
             <w:r>
               <w:rPr>
@@ -13373,7 +13389,7 @@
                 <w:sz w:val="18"/>
                 <w:szCs w:val="18"/>
               </w:rPr>
-              <w:t xml:space="preserve">Decisión</w:t>
+              <w:t xml:space="preserve">Llamada a la acción</w:t>
             </w:r>
             <w:r>
               <w:rPr>
@@ -13389,7 +13405,7 @@
                 <w:sz w:val="18"/>
                 <w:szCs w:val="18"/>
               </w:rPr>
-              <w:t xml:space="preserve">Flujo</w:t>
+              <w:t xml:space="preserve">Catálogo</w:t>
             </w:r>
           </w:p>
         </w:tc>
@@ -13457,19 +13473,19 @@
                 <w:sz w:val="18"/>
                 <w:szCs w:val="18"/>
               </w:rPr>
-              <w:t xml:space="preserve">¿Dónde termina el sistema?</w:t>
-            </w:r>
-          </w:p>
-          <w:p>
-            <w:pPr>
-              <w:spacing w:after="30" w:line="250"/>
-            </w:pPr>
-            <w:r>
-              <w:rPr>
-                <w:sz w:val="18"/>
-                <w:szCs w:val="18"/>
-              </w:rPr>
-              <w:t xml:space="preserve">Al abrir WhatsApp: la atención y la orientación al punto de venta ocurren fuera de la web.</w:t>
+              <w:t xml:space="preserve">¿Cómo sabe que mejoró?</w:t>
+            </w:r>
+          </w:p>
+          <w:p>
+            <w:pPr>
+              <w:spacing w:after="30" w:line="250"/>
+            </w:pPr>
+            <w:r>
+              <w:rPr>
+                <w:sz w:val="18"/>
+                <w:szCs w:val="18"/>
+              </w:rPr>
+              <w:t xml:space="preserve">Por comparación directa de pantallas equivalentes. La mejora en uso se medirá con datos reales cuando se publique; no afirmo aumentos de ventas.</w:t>
             </w:r>
           </w:p>
         </w:tc>
@@ -13537,7 +13553,7 @@
                 <w:sz w:val="20"/>
                 <w:szCs w:val="20"/>
               </w:rPr>
-              <w:t xml:space="preserve">Diagrama de secuencia</w:t>
+              <w:t xml:space="preserve">Antes y después: ficha y recorrido móvil</w:t>
             </w:r>
             <w:r>
               <w:rPr>
@@ -13545,7 +13561,7 @@
                 <w:sz w:val="17"/>
                 <w:szCs w:val="17"/>
               </w:rPr>
-              <w:t xml:space="preserve">   ·  60 s</w:t>
+              <w:t xml:space="preserve">   ·  70 s</w:t>
             </w:r>
           </w:p>
         </w:tc>
@@ -13611,7 +13627,7 @@
                 <w:sz w:val="18"/>
                 <w:szCs w:val="18"/>
               </w:rPr>
-              <w:t xml:space="preserve">Cómo interactúan los componentes cuando el cliente consulta un producto por WhatsApp.</w:t>
+              <w:t xml:space="preserve">La ficha pasa de mostrar datos a llevar a una consulta, también en el celular.</w:t>
             </w:r>
           </w:p>
         </w:tc>
@@ -13677,7 +13693,7 @@
                 <w:sz w:val="18"/>
                 <w:szCs w:val="18"/>
               </w:rPr>
-              <w:t xml:space="preserve">Se lee de arriba hacia abajo, en el orden de los mensajes. La ficha pide el producto a WooCommerce, arma el mensaje con el modelo y abre WhatsApp. El recuadro morado es la ampliación: registrar el inicio de la consulta sin demorar la apertura.</w:t>
+              <w:t xml:space="preserve">Antes la ficha terminaba en las especificaciones. Ahora tiene «Cotizar» junto al modelo, «Comparar» y, en el celular, una barra fija con el botón de cotización.</w:t>
             </w:r>
           </w:p>
         </w:tc>
@@ -13743,7 +13759,7 @@
                 <w:sz w:val="18"/>
                 <w:szCs w:val="18"/>
               </w:rPr>
-              <w:t xml:space="preserve">El mensaje 8 arma «quiero cotizar el modelo BH-SW12XXG».</w:t>
+              <w:t xml:space="preserve">En el celular, la ficha renovada del BH-SW12XXG muestra abajo «Cotizar · BH-SW12XXG» todo el tiempo.</w:t>
             </w:r>
           </w:p>
         </w:tc>
@@ -13811,7 +13827,7 @@
                 <w:sz w:val="18"/>
                 <w:szCs w:val="18"/>
               </w:rPr>
-              <w:t xml:space="preserve">Línea de vida</w:t>
+              <w:t xml:space="preserve">Ficha</w:t>
             </w:r>
             <w:r>
               <w:rPr>
@@ -13827,7 +13843,7 @@
                 <w:sz w:val="18"/>
                 <w:szCs w:val="18"/>
               </w:rPr>
-              <w:t xml:space="preserve">Mensaje</w:t>
+              <w:t xml:space="preserve">CTA</w:t>
             </w:r>
             <w:r>
               <w:rPr>
@@ -13843,7 +13859,7 @@
                 <w:sz w:val="18"/>
                 <w:szCs w:val="18"/>
               </w:rPr>
-              <w:t xml:space="preserve">Fragmento</w:t>
+              <w:t xml:space="preserve">Diseño adaptable</w:t>
             </w:r>
           </w:p>
         </w:tc>
@@ -13911,19 +13927,19 @@
                 <w:sz w:val="18"/>
                 <w:szCs w:val="18"/>
               </w:rPr>
-              <w:t xml:space="preserve">¿El sistema guarda la conversación?</w:t>
-            </w:r>
-          </w:p>
-          <w:p>
-            <w:pPr>
-              <w:spacing w:after="30" w:line="250"/>
-            </w:pPr>
-            <w:r>
-              <w:rPr>
-                <w:sz w:val="18"/>
-                <w:szCs w:val="18"/>
-              </w:rPr>
-              <w:t xml:space="preserve">No. Solo abriría un registro del inicio (ampliación); la conversación ocurre en WhatsApp.</w:t>
+              <w:t xml:space="preserve">¿Un clic en «Cotizar» es una venta?</w:t>
+            </w:r>
+          </w:p>
+          <w:p>
+            <w:pPr>
+              <w:spacing w:after="30" w:line="250"/>
+            </w:pPr>
+            <w:r>
+              <w:rPr>
+                <w:sz w:val="18"/>
+                <w:szCs w:val="18"/>
+              </w:rPr>
+              <w:t xml:space="preserve">No. Solo abre WhatsApp con el mensaje; la conversación y la venta ocurren fuera de la web.</w:t>
             </w:r>
           </w:p>
         </w:tc>
@@ -13991,7 +14007,7 @@
                 <w:sz w:val="20"/>
                 <w:szCs w:val="20"/>
               </w:rPr>
-              <w:t xml:space="preserve">Diagrama de clases</w:t>
+              <w:t xml:space="preserve">Flujo comercial propuesto</w:t>
             </w:r>
             <w:r>
               <w:rPr>
@@ -13999,7 +14015,7 @@
                 <w:sz w:val="17"/>
                 <w:szCs w:val="17"/>
               </w:rPr>
-              <w:t xml:space="preserve">   ·  55 s</w:t>
+              <w:t xml:space="preserve">   ·  60 s</w:t>
             </w:r>
           </w:p>
         </w:tc>
@@ -14065,7 +14081,7 @@
                 <w:sz w:val="18"/>
                 <w:szCs w:val="18"/>
               </w:rPr>
-              <w:t xml:space="preserve">Cómo se estructura la información del sistema.</w:t>
+              <w:t xml:space="preserve">El recorrido completo, desde el catálogo hasta la atención comercial, separando lo desarrollado de lo propuesto.</w:t>
             </w:r>
           </w:p>
         </w:tc>
@@ -14131,7 +14147,7 @@
                 <w:sz w:val="18"/>
                 <w:szCs w:val="18"/>
               </w:rPr>
-              <w:t xml:space="preserve">El producto es el centro: pertenece a una o más categorías y se compone de especificaciones e imágenes. Las clases en morado son propuestas: el evento de consulta registra que se inició una consulta, y el distribuidor forma el directorio.</w:t>
+              <w:t xml:space="preserve">La fila negra es lo que ya funciona en la web renovada. Debajo, en morado punteado, las ampliaciones: registrar el inicio de la consulta, un directorio estructurado y el seguimiento, que requiere un mecanismo adicional.</w:t>
             </w:r>
           </w:p>
         </w:tc>
@@ -14197,7 +14213,7 @@
                 <w:sz w:val="18"/>
                 <w:szCs w:val="18"/>
               </w:rPr>
-              <w:t xml:space="preserve">Si se elimina el producto BH-SW12XXG, sus especificaciones desaparecen con él: eso es la composición.</w:t>
+              <w:t xml:space="preserve">El mensaje dice: «Hola Black Hawk, vengo de la web y quiero cotizar el modelo BH-SW12XXG».</w:t>
             </w:r>
           </w:p>
         </w:tc>
@@ -14265,7 +14281,7 @@
                 <w:sz w:val="18"/>
                 <w:szCs w:val="18"/>
               </w:rPr>
-              <w:t xml:space="preserve">Clase</w:t>
+              <w:t xml:space="preserve">Recorrido</w:t>
             </w:r>
             <w:r>
               <w:rPr>
@@ -14281,7 +14297,7 @@
                 <w:sz w:val="18"/>
                 <w:szCs w:val="18"/>
               </w:rPr>
-              <w:t xml:space="preserve">Asociación</w:t>
+              <w:t xml:space="preserve">CTA</w:t>
             </w:r>
             <w:r>
               <w:rPr>
@@ -14297,23 +14313,7 @@
                 <w:sz w:val="18"/>
                 <w:szCs w:val="18"/>
               </w:rPr>
-              <w:t xml:space="preserve">Multiplicidad</w:t>
-            </w:r>
-            <w:r>
-              <w:rPr>
-                <w:sz w:val="18"/>
-                <w:szCs w:val="18"/>
-              </w:rPr>
-              <w:t xml:space="preserve">  ·  </w:t>
-            </w:r>
-            <w:r>
-              <w:rPr>
-                <w:b/>
-                <w:bCs/>
-                <w:sz w:val="18"/>
-                <w:szCs w:val="18"/>
-              </w:rPr>
-              <w:t xml:space="preserve">Composición</w:t>
+              <w:t xml:space="preserve">Ampliación</w:t>
             </w:r>
           </w:p>
         </w:tc>
@@ -14381,19 +14381,19 @@
                 <w:sz w:val="18"/>
                 <w:szCs w:val="18"/>
               </w:rPr>
-              <w:t xml:space="preserve">¿Qué significa 1..*?</w:t>
-            </w:r>
-          </w:p>
-          <w:p>
-            <w:pPr>
-              <w:spacing w:after="30" w:line="250"/>
-            </w:pPr>
-            <w:r>
-              <w:rPr>
-                <w:sz w:val="18"/>
-                <w:szCs w:val="18"/>
-              </w:rPr>
-              <w:t xml:space="preserve">Uno o más: cada producto pertenece al menos a una categoría.</w:t>
+              <w:t xml:space="preserve">¿El sistema sabe si el cliente compró?</w:t>
+            </w:r>
+          </w:p>
+          <w:p>
+            <w:pPr>
+              <w:spacing w:after="30" w:line="250"/>
+            </w:pPr>
+            <w:r>
+              <w:rPr>
+                <w:sz w:val="18"/>
+                <w:szCs w:val="18"/>
+              </w:rPr>
+              <w:t xml:space="preserve">No. Solo sabe que se abrió WhatsApp desde una página; el resultado requiere seguimiento manual u otra herramienta.</w:t>
             </w:r>
           </w:p>
         </w:tc>
@@ -14461,7 +14461,7 @@
                 <w:sz w:val="20"/>
                 <w:szCs w:val="20"/>
               </w:rPr>
-              <w:t xml:space="preserve">Arquitectura y componentes</w:t>
+              <w:t xml:space="preserve">Funcionalidades principales</w:t>
             </w:r>
             <w:r>
               <w:rPr>
@@ -14469,7 +14469,7 @@
                 <w:sz w:val="17"/>
                 <w:szCs w:val="17"/>
               </w:rPr>
-              <w:t xml:space="preserve">   ·  60 s</w:t>
+              <w:t xml:space="preserve">   ·  55 s</w:t>
             </w:r>
           </w:p>
         </w:tc>
@@ -14535,7 +14535,7 @@
                 <w:sz w:val="18"/>
                 <w:szCs w:val="18"/>
               </w:rPr>
-              <w:t xml:space="preserve">Cómo está organizado técnicamente el sistema.</w:t>
+              <w:t xml:space="preserve">Cinco grupos de funciones: cuatro desarrollados en el rediseño y uno propuesto.</w:t>
             </w:r>
           </w:p>
         </w:tc>
@@ -14601,7 +14601,7 @@
                 <w:sz w:val="18"/>
                 <w:szCs w:val="18"/>
               </w:rPr>
-              <w:t xml:space="preserve">El rediseño vive en el tema hijo: plantillas, páginas y el botón de WhatsApp. WooCommerce maneja los productos; YITH Catalog Mode oculta precio y carrito; todo corre sobre WordPress y MySQL. El módulo propio en morado alojaría las ampliaciones.</w:t>
+              <w:t xml:space="preserve">No enumero módulos sueltos: agrupo por lo que resuelven. La administración usa el panel de WordPress y WooCommerce, que ya existía, sin programar uno nuevo.</w:t>
             </w:r>
           </w:p>
         </w:tc>
@@ -14667,7 +14667,7 @@
                 <w:sz w:val="18"/>
                 <w:szCs w:val="18"/>
               </w:rPr>
-              <w:t xml:space="preserve">Como el rediseño está en el tema hijo, actualizar WooCommerce no borra los cambios.</w:t>
+              <w:t xml:space="preserve">El comparador admite hasta 3 modelos y guarda la selección en el navegador durante 24 horas.</w:t>
             </w:r>
           </w:p>
         </w:tc>
@@ -14735,7 +14735,7 @@
                 <w:sz w:val="18"/>
                 <w:szCs w:val="18"/>
               </w:rPr>
-              <w:t xml:space="preserve">Componente</w:t>
+              <w:t xml:space="preserve">Rediseño</w:t>
             </w:r>
             <w:r>
               <w:rPr>
@@ -14751,7 +14751,7 @@
                 <w:sz w:val="18"/>
                 <w:szCs w:val="18"/>
               </w:rPr>
-              <w:t xml:space="preserve">Dependencia</w:t>
+              <w:t xml:space="preserve">Catálogo</w:t>
             </w:r>
             <w:r>
               <w:rPr>
@@ -14767,7 +14767,7 @@
                 <w:sz w:val="18"/>
                 <w:szCs w:val="18"/>
               </w:rPr>
-              <w:t xml:space="preserve">Tema hijo</w:t>
+              <w:t xml:space="preserve">Recorrido comercial</w:t>
             </w:r>
           </w:p>
         </w:tc>
@@ -14835,19 +14835,19 @@
                 <w:sz w:val="18"/>
                 <w:szCs w:val="18"/>
               </w:rPr>
-              <w:t xml:space="preserve">¿Dónde está su desarrollo?</w:t>
-            </w:r>
-          </w:p>
-          <w:p>
-            <w:pPr>
-              <w:spacing w:after="30" w:line="250"/>
-            </w:pPr>
-            <w:r>
-              <w:rPr>
-                <w:sz w:val="18"/>
-                <w:szCs w:val="18"/>
-              </w:rPr>
-              <w:t xml:space="preserve">En el tema hijo rozer-child: plantillas, estilos, scripts del buscador y del comparador, y las páginas nuevas.</w:t>
+              <w:t xml:space="preserve">¿Qué funciones siguen pendientes?</w:t>
+            </w:r>
+          </w:p>
+          <w:p>
+            <w:pPr>
+              <w:spacing w:after="30" w:line="250"/>
+            </w:pPr>
+            <w:r>
+              <w:rPr>
+                <w:sz w:val="18"/>
+                <w:szCs w:val="18"/>
+              </w:rPr>
+              <w:t xml:space="preserve">El registro de consultas, el directorio estructurado, los reportes y la auditoría: son ampliaciones propuestas.</w:t>
             </w:r>
           </w:p>
         </w:tc>

</xml_diff>